<commit_message>
Manuscript R10: state that adult ratings were collected after the child data
Co-Authored-By: Claude Opus 5.5 <noreply@anthropic.com>
Claude-Session: https://claude.ai/code/session_01LmwJh5mSZgrzkCyUsBhDdt
</commit_message>
<xml_diff>
--- a/drafts/Manuscript_R10_APA.docx
+++ b/drafts/Manuscript_R10_APA.docx
@@ -1263,7 +1263,7 @@
       <w:proofErr w:type="spellEnd"/>
       <w:r>
         <w:rPr/>
-        <w:t xml:space="preserve"> “extinguished”). Adult ratings of result likelihood and action typicality were collected to verify and characterize this contrast. In eight pairs, the expected stronger-association expression received reliably higher ratings on both dimensions; these pairs, comprising eight stronger-association and eight weaker-association V1s, form the materials for the analyses of Experiment 1. The two remaining pairs, in which the typicality difference was reversed or neither difference was reliable, are excluded from these analyses (see Method).</w:t>
+        <w:t xml:space="preserve"> “extinguished”). After the child data had been collected, adult ratings of result likelihood and action typicality were obtained to verify and characterize this contrast. In eight pairs, the expected stronger-association expression received reliably higher ratings on both dimensions; these pairs, comprising eight stronger-association and eight weaker-association V1s, form the materials for the analyses of Experiment 1. The two remaining pairs, in which the typicality difference was reversed or neither difference was reliable, are excluded from these analyses (see Method).</w:t>
       </w:r>
     </w:p>
     <w:p>
@@ -4781,7 +4781,13 @@
         <w:t>⟦指导语、量表两端标签及一个题目的原文和译文待补⟧</w:t>
       </w:r>
       <w:r>
-        <w:t xml:space="preserve"> Because the ratings were collected for sentences naming the expressions, they characterize the action–result relation that each expression describes, not the particular videos. The order of the two blocks was counterbalanced across four lists, which limits, but does not remove, carryover from one judgment to the other. All raters completed all items, and no ratings were excluded.</w:t>
+        <w:t xml:space="preserve"> Because the ratings were collected for sentences naming the expressions, they characterize the action–result relation that each expression describes, not the particular videos. The order of the two blocks was counterbalanced across four lists, which limits, but does not remove, carryover from one judgment to the other. All raters completed all items, and no ratings were excluded. The ratings were collected after the child data had been collected and initially analyzed with the original Strong/Weak coding; the raters did not take part in the child experiments and received no information about children’s responses. </w:t>
+      </w:r>
+      <w:r>
+        <w:rPr>
+          <w:highlight w:val="yellow"/>
+        </w:rPr>
+        <w:t>⟦待核：确认评定者未参加儿童实验、未获知儿童结果⟧</w:t>
       </w:r>
     </w:p>
     <w:p>
@@ -4909,7 +4915,7 @@
         <w:t>hóng</w:t>
       </w:r>
       <w:r>
-        <w:t xml:space="preserve"> “red”), neither difference was reliable (likelihood: 16.40 points, 95% CI [−1.00, 33.40]; typicality: 0.45 points, 95% CI [−0.90, 1.85]). Because action–result association is defined by the two ratings jointly, the actions in these pairs cannot be assigned to the two sets. The two pairs remained in the experimental lists, so all participants saw all 10 pairs, but their trials are excluded from the analyses of Experiment 1. The original design included all 10 pairs, and an initial analysis of the child data used all of them with the original Strong/Weak coding. Pairs 7 and 8 were excluded after that analysis. The exclusion criterion refers only to the rating data, not to children’s responses, but because the decision followed an inspection of the child data, analyses with all 10 pairs are reported alongside the main analyses of Experiment 1 (see Sensitivity Analyses).</w:t>
+        <w:t xml:space="preserve"> “red”), neither difference was reliable (likelihood: 16.40 points, 95% CI [−1.00, 33.40]; typicality: 0.45 points, 95% CI [−0.90, 1.85]). Because action–result association is defined by the two ratings jointly, the actions in these pairs cannot be assigned to the two sets. The two pairs remained in the experimental lists, so all participants saw all 10 pairs, but their trials are excluded from the analyses of Experiment 1. The original design included all 10 pairs, and an initial analysis of the child data used all of them with the original Strong/Weak coding. The adult ratings were collected, and Pairs 7 and 8 excluded, after that analysis. The exclusion criterion refers only to the rating data, not to children’s responses, but because both steps followed an inspection of the child data, analyses with all 10 pairs are reported alongside the main analyses of Experiment 1 (see Sensitivity Analyses).</w:t>
       </w:r>
     </w:p>
     <w:p>
@@ -5691,7 +5697,7 @@
         <w:t>tī</w:t>
       </w:r>
       <w:r>
-        <w:t xml:space="preserve"> “kick” with a bottle and with a door, would test this directly. Third, likelihood, typicality, and RVC conventionality covary across the retained pairs. Separating them would require pairs in which they diverge, as in the excluded Pair 7, with the two ratings collected from different raters. Fourth, with eight pairs and sets assigned between participants, each difference between sets rests on few items and small groups, and item-level estimates are descriptive; in addition, two pairs were excluded after an initial analysis of the child data, so the eight-pair results should be read together with the 10-pair analyses. Fifth, the ratings describe expressions rather than videos, and the videos did not always elicit the intended V1. Finally, children and adults were tested in different modalities, and comprehension and production were tested in independent samples.</w:t>
+        <w:t xml:space="preserve"> “kick” with a bottle and with a door, would test this directly. Third, likelihood, typicality, and RVC conventionality covary across the retained pairs. Separating them would require pairs in which they diverge, as in the excluded Pair 7, with the two ratings collected from different raters. Fourth, with eight pairs and sets assigned between participants, each difference between sets rests on few items and small groups, and item-level estimates are descriptive; in addition, the ratings were collected and two pairs excluded after an initial analysis of the child data, so the eight-pair results should be read together with the 10-pair analyses. Fifth, the ratings describe expressions rather than videos, and the videos did not always elicit the intended V1. Finally, children and adults were tested in different modalities, and comprehension and production were tested in independent samples.</w:t>
       </w:r>
     </w:p>
     <w:p>

</xml_diff>